<commit_message>
vault backup: 2026-08-27 16:30:42
</commit_message>
<xml_diff>
--- a/POC-EuroCRM-Vault/projects/EuroCRM_Solution_Overview_Document_2026-08-27.docx
+++ b/POC-EuroCRM-Vault/projects/EuroCRM_Solution_Overview_Document_2026-08-27.docx
@@ -12783,15 +12783,41 @@
     </w:p>
     <w:p>
       <w:pPr>
-        <w:pStyle w:val="Heading3"/>
+        <w:jc w:val="center"/>
       </w:pPr>
       <w:r>
-        <w:t>Layered Solution Model</w:t>
-      </w:r>
-    </w:p>
-    <w:p>
-      <w:r>
-        <w:t>Shows the L0-L7 layer hierarchy and extension rules.</w:t>
+        <w:drawing>
+          <wp:inline xmlns:a="http://schemas.openxmlformats.org/drawingml/2006/main" xmlns:pic="http://schemas.openxmlformats.org/drawingml/2006/picture">
+            <wp:extent cx="5760720" cy="4594893"/>
+            <wp:docPr id="1" name="Picture 1"/>
+            <wp:cNvGraphicFramePr>
+              <a:graphicFrameLocks noChangeAspect="1"/>
+            </wp:cNvGraphicFramePr>
+            <a:graphic>
+              <a:graphicData uri="http://schemas.openxmlformats.org/drawingml/2006/picture">
+                <pic:pic>
+                  <pic:nvPicPr>
+                    <pic:cNvPr id="0" name="EuroCRM Architecture.png"/>
+                    <pic:cNvPicPr/>
+                  </pic:nvPicPr>
+                  <pic:blipFill>
+                    <a:blip r:embed="rId13"/>
+                    <a:stretch>
+                      <a:fillRect/>
+                    </a:stretch>
+                  </pic:blipFill>
+                  <pic:spPr>
+                    <a:xfrm>
+                      <a:off x="0" y="0"/>
+                      <a:ext cx="5760720" cy="4594893"/>
+                    </a:xfrm>
+                    <a:prstGeom prst="rect"/>
+                  </pic:spPr>
+                </pic:pic>
+              </a:graphicData>
+            </a:graphic>
+          </wp:inline>
+        </w:drawing>
       </w:r>
     </w:p>
     <w:p>
@@ -12799,12 +12825,103 @@
         <w:pStyle w:val="Heading3"/>
       </w:pPr>
       <w:r>
+        <w:t>Layered Solution Model</w:t>
+      </w:r>
+    </w:p>
+    <w:p>
+      <w:r>
+        <w:t>Shows the L0-L7 layer hierarchy and extension rules.</w:t>
+      </w:r>
+    </w:p>
+    <w:p>
+      <w:pPr>
+        <w:jc w:val="center"/>
+      </w:pPr>
+      <w:r>
+        <w:drawing>
+          <wp:inline xmlns:a="http://schemas.openxmlformats.org/drawingml/2006/main" xmlns:pic="http://schemas.openxmlformats.org/drawingml/2006/picture">
+            <wp:extent cx="5760720" cy="2636949"/>
+            <wp:docPr id="2" name="Picture 2"/>
+            <wp:cNvGraphicFramePr>
+              <a:graphicFrameLocks noChangeAspect="1"/>
+            </wp:cNvGraphicFramePr>
+            <a:graphic>
+              <a:graphicData uri="http://schemas.openxmlformats.org/drawingml/2006/picture">
+                <pic:pic>
+                  <pic:nvPicPr>
+                    <pic:cNvPr id="0" name="EuroCRM Layered Architecture.png"/>
+                    <pic:cNvPicPr/>
+                  </pic:nvPicPr>
+                  <pic:blipFill>
+                    <a:blip r:embed="rId14"/>
+                    <a:stretch>
+                      <a:fillRect/>
+                    </a:stretch>
+                  </pic:blipFill>
+                  <pic:spPr>
+                    <a:xfrm>
+                      <a:off x="0" y="0"/>
+                      <a:ext cx="5760720" cy="2636949"/>
+                    </a:xfrm>
+                    <a:prstGeom prst="rect"/>
+                  </pic:spPr>
+                </pic:pic>
+              </a:graphicData>
+            </a:graphic>
+          </wp:inline>
+        </w:drawing>
+      </w:r>
+    </w:p>
+    <w:p>
+      <w:pPr>
+        <w:pStyle w:val="Heading3"/>
+      </w:pPr>
+      <w:r>
         <w:t>Data Flow &amp; Integrations</w:t>
       </w:r>
     </w:p>
     <w:p>
       <w:r>
         <w:t>Shows how data flows through the system and external integrations.</w:t>
+      </w:r>
+    </w:p>
+    <w:p>
+      <w:pPr>
+        <w:jc w:val="center"/>
+      </w:pPr>
+      <w:r>
+        <w:drawing>
+          <wp:inline xmlns:a="http://schemas.openxmlformats.org/drawingml/2006/main" xmlns:pic="http://schemas.openxmlformats.org/drawingml/2006/picture">
+            <wp:extent cx="5760720" cy="3054521"/>
+            <wp:docPr id="3" name="Picture 3"/>
+            <wp:cNvGraphicFramePr>
+              <a:graphicFrameLocks noChangeAspect="1"/>
+            </wp:cNvGraphicFramePr>
+            <a:graphic>
+              <a:graphicData uri="http://schemas.openxmlformats.org/drawingml/2006/picture">
+                <pic:pic>
+                  <pic:nvPicPr>
+                    <pic:cNvPr id="0" name="EuroCRM Data Flow.png"/>
+                    <pic:cNvPicPr/>
+                  </pic:nvPicPr>
+                  <pic:blipFill>
+                    <a:blip r:embed="rId15"/>
+                    <a:stretch>
+                      <a:fillRect/>
+                    </a:stretch>
+                  </pic:blipFill>
+                  <pic:spPr>
+                    <a:xfrm>
+                      <a:off x="0" y="0"/>
+                      <a:ext cx="5760720" cy="3054521"/>
+                    </a:xfrm>
+                    <a:prstGeom prst="rect"/>
+                  </pic:spPr>
+                </pic:pic>
+              </a:graphicData>
+            </a:graphic>
+          </wp:inline>
+        </w:drawing>
       </w:r>
     </w:p>
     <w:p>
@@ -24713,6 +24830,45 @@
     </w:p>
     <w:p>
       <w:pPr>
+        <w:jc w:val="center"/>
+      </w:pPr>
+      <w:r>
+        <w:drawing>
+          <wp:inline xmlns:a="http://schemas.openxmlformats.org/drawingml/2006/main" xmlns:pic="http://schemas.openxmlformats.org/drawingml/2006/picture">
+            <wp:extent cx="5760720" cy="4017715"/>
+            <wp:docPr id="4" name="Picture 4"/>
+            <wp:cNvGraphicFramePr>
+              <a:graphicFrameLocks noChangeAspect="1"/>
+            </wp:cNvGraphicFramePr>
+            <a:graphic>
+              <a:graphicData uri="http://schemas.openxmlformats.org/drawingml/2006/picture">
+                <pic:pic>
+                  <pic:nvPicPr>
+                    <pic:cNvPr id="0" name="EuroCRM Client Data Model.png"/>
+                    <pic:cNvPicPr/>
+                  </pic:nvPicPr>
+                  <pic:blipFill>
+                    <a:blip r:embed="rId16"/>
+                    <a:stretch>
+                      <a:fillRect/>
+                    </a:stretch>
+                  </pic:blipFill>
+                  <pic:spPr>
+                    <a:xfrm>
+                      <a:off x="0" y="0"/>
+                      <a:ext cx="5760720" cy="4017715"/>
+                    </a:xfrm>
+                    <a:prstGeom prst="rect"/>
+                  </pic:spPr>
+                </pic:pic>
+              </a:graphicData>
+            </a:graphic>
+          </wp:inline>
+        </w:drawing>
+      </w:r>
+    </w:p>
+    <w:p>
+      <w:pPr>
         <w:pStyle w:val="Heading2"/>
       </w:pPr>
       <w:r>
@@ -25181,6 +25337,45 @@
       </w:pPr>
       <w:r>
         <w:t>Data Schema</w:t>
+      </w:r>
+    </w:p>
+    <w:p>
+      <w:pPr>
+        <w:jc w:val="center"/>
+      </w:pPr>
+      <w:r>
+        <w:drawing>
+          <wp:inline xmlns:a="http://schemas.openxmlformats.org/drawingml/2006/main" xmlns:pic="http://schemas.openxmlformats.org/drawingml/2006/picture">
+            <wp:extent cx="5760720" cy="5547360"/>
+            <wp:docPr id="5" name="Picture 5"/>
+            <wp:cNvGraphicFramePr>
+              <a:graphicFrameLocks noChangeAspect="1"/>
+            </wp:cNvGraphicFramePr>
+            <a:graphic>
+              <a:graphicData uri="http://schemas.openxmlformats.org/drawingml/2006/picture">
+                <pic:pic>
+                  <pic:nvPicPr>
+                    <pic:cNvPr id="0" name="EuroCRM Property Data Model.png"/>
+                    <pic:cNvPicPr/>
+                  </pic:nvPicPr>
+                  <pic:blipFill>
+                    <a:blip r:embed="rId17"/>
+                    <a:stretch>
+                      <a:fillRect/>
+                    </a:stretch>
+                  </pic:blipFill>
+                  <pic:spPr>
+                    <a:xfrm>
+                      <a:off x="0" y="0"/>
+                      <a:ext cx="5760720" cy="5547360"/>
+                    </a:xfrm>
+                    <a:prstGeom prst="rect"/>
+                  </pic:spPr>
+                </pic:pic>
+              </a:graphicData>
+            </a:graphic>
+          </wp:inline>
+        </w:drawing>
       </w:r>
     </w:p>
     <w:p>
@@ -26774,6 +26969,45 @@
     </w:p>
     <w:p>
       <w:pPr>
+        <w:jc w:val="center"/>
+      </w:pPr>
+      <w:r>
+        <w:drawing>
+          <wp:inline xmlns:a="http://schemas.openxmlformats.org/drawingml/2006/main" xmlns:pic="http://schemas.openxmlformats.org/drawingml/2006/picture">
+            <wp:extent cx="5760720" cy="3059921"/>
+            <wp:docPr id="6" name="Picture 6"/>
+            <wp:cNvGraphicFramePr>
+              <a:graphicFrameLocks noChangeAspect="1"/>
+            </wp:cNvGraphicFramePr>
+            <a:graphic>
+              <a:graphicData uri="http://schemas.openxmlformats.org/drawingml/2006/picture">
+                <pic:pic>
+                  <pic:nvPicPr>
+                    <pic:cNvPr id="0" name="EuroCRM Capital Markets Data Model.png"/>
+                    <pic:cNvPicPr/>
+                  </pic:nvPicPr>
+                  <pic:blipFill>
+                    <a:blip r:embed="rId18"/>
+                    <a:stretch>
+                      <a:fillRect/>
+                    </a:stretch>
+                  </pic:blipFill>
+                  <pic:spPr>
+                    <a:xfrm>
+                      <a:off x="0" y="0"/>
+                      <a:ext cx="5760720" cy="3059921"/>
+                    </a:xfrm>
+                    <a:prstGeom prst="rect"/>
+                  </pic:spPr>
+                </pic:pic>
+              </a:graphicData>
+            </a:graphic>
+          </wp:inline>
+        </w:drawing>
+      </w:r>
+    </w:p>
+    <w:p>
+      <w:pPr>
         <w:pStyle w:val="Heading2"/>
       </w:pPr>
       <w:r>
@@ -28196,6 +28430,45 @@
     </w:p>
     <w:p>
       <w:pPr>
+        <w:jc w:val="center"/>
+      </w:pPr>
+      <w:r>
+        <w:drawing>
+          <wp:inline xmlns:a="http://schemas.openxmlformats.org/drawingml/2006/main" xmlns:pic="http://schemas.openxmlformats.org/drawingml/2006/picture">
+            <wp:extent cx="5760720" cy="5192965"/>
+            <wp:docPr id="7" name="Picture 7"/>
+            <wp:cNvGraphicFramePr>
+              <a:graphicFrameLocks noChangeAspect="1"/>
+            </wp:cNvGraphicFramePr>
+            <a:graphic>
+              <a:graphicData uri="http://schemas.openxmlformats.org/drawingml/2006/picture">
+                <pic:pic>
+                  <pic:nvPicPr>
+                    <pic:cNvPr id="0" name="EuroCRM WIP Data Model.png"/>
+                    <pic:cNvPicPr/>
+                  </pic:nvPicPr>
+                  <pic:blipFill>
+                    <a:blip r:embed="rId19"/>
+                    <a:stretch>
+                      <a:fillRect/>
+                    </a:stretch>
+                  </pic:blipFill>
+                  <pic:spPr>
+                    <a:xfrm>
+                      <a:off x="0" y="0"/>
+                      <a:ext cx="5760720" cy="5192965"/>
+                    </a:xfrm>
+                    <a:prstGeom prst="rect"/>
+                  </pic:spPr>
+                </pic:pic>
+              </a:graphicData>
+            </a:graphic>
+          </wp:inline>
+        </w:drawing>
+      </w:r>
+    </w:p>
+    <w:p>
+      <w:pPr>
         <w:pStyle w:val="Heading2"/>
       </w:pPr>
       <w:r>
@@ -30444,6 +30717,45 @@
       </w:pPr>
       <w:r>
         <w:t>Data Schema</w:t>
+      </w:r>
+    </w:p>
+    <w:p>
+      <w:pPr>
+        <w:jc w:val="center"/>
+      </w:pPr>
+      <w:r>
+        <w:drawing>
+          <wp:inline xmlns:a="http://schemas.openxmlformats.org/drawingml/2006/main" xmlns:pic="http://schemas.openxmlformats.org/drawingml/2006/picture">
+            <wp:extent cx="5760720" cy="1845965"/>
+            <wp:docPr id="8" name="Picture 8"/>
+            <wp:cNvGraphicFramePr>
+              <a:graphicFrameLocks noChangeAspect="1"/>
+            </wp:cNvGraphicFramePr>
+            <a:graphic>
+              <a:graphicData uri="http://schemas.openxmlformats.org/drawingml/2006/picture">
+                <pic:pic>
+                  <pic:nvPicPr>
+                    <pic:cNvPr id="0" name="EuroCRM Core Data Model.png"/>
+                    <pic:cNvPicPr/>
+                  </pic:nvPicPr>
+                  <pic:blipFill>
+                    <a:blip r:embed="rId20"/>
+                    <a:stretch>
+                      <a:fillRect/>
+                    </a:stretch>
+                  </pic:blipFill>
+                  <pic:spPr>
+                    <a:xfrm>
+                      <a:off x="0" y="0"/>
+                      <a:ext cx="5760720" cy="1845965"/>
+                    </a:xfrm>
+                    <a:prstGeom prst="rect"/>
+                  </pic:spPr>
+                </pic:pic>
+              </a:graphicData>
+            </a:graphic>
+          </wp:inline>
+        </w:drawing>
       </w:r>
     </w:p>
     <w:p>

</xml_diff>

<commit_message>
vault backup: 2026-09-02 11:23:37
</commit_message>
<xml_diff>
--- a/POC-EuroCRM-Vault/projects/EuroCRM_Solution_Overview_Document_2026-08-27.docx
+++ b/POC-EuroCRM-Vault/projects/EuroCRM_Solution_Overview_Document_2026-08-27.docx
@@ -5390,7 +5390,59 @@
           </w:tcPr>
           <w:p>
             <w:r>
-              <w:t>Author/Solution Lead</w:t>
+              <w:t>Author/Solution Architect</w:t>
+            </w:r>
+          </w:p>
+        </w:tc>
+        <w:tc>
+          <w:tcPr>
+            <w:tcW w:type="dxa" w:w="1805"/>
+          </w:tcPr>
+          <w:p>
+            <w:r>
+              <w:t>Enterprise</w:t>
+            </w:r>
+          </w:p>
+        </w:tc>
+        <w:tc>
+          <w:tcPr>
+            <w:tcW w:type="dxa" w:w="1805"/>
+          </w:tcPr>
+          <w:p>
+            <w:r>
+              <w:t>High</w:t>
+            </w:r>
+          </w:p>
+        </w:tc>
+        <w:tc>
+          <w:tcPr>
+            <w:tcW w:type="dxa" w:w="1805"/>
+          </w:tcPr>
+          <w:p>
+            <w:r>
+              <w:t>High</w:t>
+            </w:r>
+          </w:p>
+        </w:tc>
+      </w:tr>
+      <w:tr>
+        <w:tc>
+          <w:tcPr>
+            <w:tcW w:type="dxa" w:w="1805"/>
+          </w:tcPr>
+          <w:p>
+            <w:r>
+              <w:t>Hannah Nguyen</w:t>
+            </w:r>
+          </w:p>
+        </w:tc>
+        <w:tc>
+          <w:tcPr>
+            <w:tcW w:type="dxa" w:w="1805"/>
+          </w:tcPr>
+          <w:p>
+            <w:r>
+              <w:t>Business Analyst/Solution Lead</w:t>
             </w:r>
           </w:p>
         </w:tc>
@@ -5484,7 +5536,7 @@
           </w:tcPr>
           <w:p>
             <w:r>
-              <w:t>CTO</w:t>
+              <w:t>Nick Wadge</w:t>
             </w:r>
           </w:p>
         </w:tc>
@@ -5536,7 +5588,7 @@
           </w:tcPr>
           <w:p>
             <w:r>
-              <w:t>European MDs</w:t>
+              <w:t>Marco Capelli</w:t>
             </w:r>
           </w:p>
         </w:tc>
@@ -10325,19 +10377,19 @@
     <w:p>
       <w:pPr/>
       <w:r>
-        <w:t>Valuations (Future)</w:t>
-      </w:r>
-    </w:p>
-    <w:p>
-      <w:pPr/>
-      <w:r>
-        <w:t>Residential (Future)</w:t>
-      </w:r>
-    </w:p>
-    <w:p>
-      <w:pPr/>
-      <w:r>
-        <w:t>Private Office (Future)</w:t>
+        <w:t>Valuations (Foundation)</w:t>
+      </w:r>
+    </w:p>
+    <w:p>
+      <w:pPr/>
+      <w:r>
+        <w:t>Residential (Foundation)</w:t>
+      </w:r>
+    </w:p>
+    <w:p>
+      <w:pPr/>
+      <w:r>
+        <w:t>Private Office (Foundation)</w:t>
       </w:r>
     </w:p>
     <w:p>
@@ -13024,7 +13076,7 @@
       <w:r>
         <w:drawing>
           <wp:inline xmlns:a="http://schemas.openxmlformats.org/drawingml/2006/main" xmlns:pic="http://schemas.openxmlformats.org/drawingml/2006/picture">
-            <wp:extent cx="5760720" cy="4594893"/>
+            <wp:extent cx="5760720" cy="4813909"/>
             <wp:docPr id="1" name="Picture 1"/>
             <wp:cNvGraphicFramePr>
               <a:graphicFrameLocks noChangeAspect="1"/>
@@ -13045,7 +13097,7 @@
                   <pic:spPr>
                     <a:xfrm>
                       <a:off x="0" y="0"/>
-                      <a:ext cx="5760720" cy="4594893"/>
+                      <a:ext cx="5760720" cy="4813909"/>
                     </a:xfrm>
                     <a:prstGeom prst="rect"/>
                   </pic:spPr>
@@ -13076,7 +13128,7 @@
       <w:r>
         <w:drawing>
           <wp:inline xmlns:a="http://schemas.openxmlformats.org/drawingml/2006/main" xmlns:pic="http://schemas.openxmlformats.org/drawingml/2006/picture">
-            <wp:extent cx="5760720" cy="2636949"/>
+            <wp:extent cx="5760720" cy="2560990"/>
             <wp:docPr id="2" name="Picture 2"/>
             <wp:cNvGraphicFramePr>
               <a:graphicFrameLocks noChangeAspect="1"/>
@@ -13097,7 +13149,7 @@
                   <pic:spPr>
                     <a:xfrm>
                       <a:off x="0" y="0"/>
-                      <a:ext cx="5760720" cy="2636949"/>
+                      <a:ext cx="5760720" cy="2560990"/>
                     </a:xfrm>
                     <a:prstGeom prst="rect"/>
                   </pic:spPr>
@@ -13128,7 +13180,7 @@
       <w:r>
         <w:drawing>
           <wp:inline xmlns:a="http://schemas.openxmlformats.org/drawingml/2006/main" xmlns:pic="http://schemas.openxmlformats.org/drawingml/2006/picture">
-            <wp:extent cx="5760720" cy="3054521"/>
+            <wp:extent cx="5760720" cy="3207405"/>
             <wp:docPr id="3" name="Picture 3"/>
             <wp:cNvGraphicFramePr>
               <a:graphicFrameLocks noChangeAspect="1"/>
@@ -13149,7 +13201,7 @@
                   <pic:spPr>
                     <a:xfrm>
                       <a:off x="0" y="0"/>
-                      <a:ext cx="5760720" cy="3054521"/>
+                      <a:ext cx="5760720" cy="3207405"/>
                     </a:xfrm>
                     <a:prstGeom prst="rect"/>
                   </pic:spPr>
@@ -14821,7 +14873,73 @@
           </w:p>
         </w:tc>
       </w:tr>
+      <w:tr>
+        <w:tc>
+          <w:tcPr>
+            <w:tcW w:type="dxa" w:w="3009"/>
+          </w:tcPr>
+          <w:p>
+            <w:r>
+              <w:t>ECS Publisher</w:t>
+            </w:r>
+          </w:p>
+        </w:tc>
+        <w:tc>
+          <w:tcPr>
+            <w:tcW w:type="dxa" w:w="3009"/>
+          </w:tcPr>
+          <w:p>
+            <w:r>
+              <w:t>ECS (Enterprise Connectivity Services)</w:t>
+            </w:r>
+          </w:p>
+        </w:tc>
+        <w:tc>
+          <w:tcPr>
+            <w:tcW w:type="dxa" w:w="3009"/>
+          </w:tcPr>
+          <w:p>
+            <w:r>
+              <w:t>Publish change notifications for Major entity create/update</w:t>
+            </w:r>
+          </w:p>
+        </w:tc>
+      </w:tr>
     </w:tbl>
+    <w:p>
+      <w:pPr>
+        <w:pStyle w:val="Heading3"/>
+      </w:pPr>
+      <w:r>
+        <w:t>ECS Publications</w:t>
+      </w:r>
+    </w:p>
+    <w:p>
+      <w:r>
+        <w:t xml:space="preserve">Every create/update of a </w:t>
+      </w:r>
+      <w:r>
+        <w:rPr>
+          <w:b/>
+          <w:i w:val="0"/>
+        </w:rPr>
+        <w:t>Major entity</w:t>
+      </w:r>
+      <w:r>
+        <w:t xml:space="preserve"> (Client, Property, Deal domains — confirm definitive list with TDA) publishes a change notification to the Knight Frank ECS platform, the internal notification and message bus that keeps other systems informed of changes. Publication is performed from a Dataverse plugin / Power Automate flow; delivery is asynchronous and logged in </w:t>
+      </w:r>
+      <w:r>
+        <w:rPr>
+          <w:rFonts w:ascii="Consolas" w:hAnsi="Consolas"/>
+          <w:b w:val="0"/>
+          <w:i w:val="0"/>
+        </w:rPr>
+        <w:t>kf_IntegrationLog</w:t>
+      </w:r>
+      <w:r>
+        <w:t>. See architecture application for the detailed pattern.</w:t>
+      </w:r>
+    </w:p>
     <w:p>
       <w:pPr>
         <w:pStyle w:val="Heading2"/>
@@ -18408,7 +18526,184 @@
           </w:p>
         </w:tc>
       </w:tr>
+      <w:tr>
+        <w:tc>
+          <w:tcPr>
+            <w:tcW w:type="dxa" w:w="3009"/>
+          </w:tcPr>
+          <w:p>
+            <w:r>
+              <w:t>ECS Publish</w:t>
+            </w:r>
+          </w:p>
+        </w:tc>
+        <w:tc>
+          <w:tcPr>
+            <w:tcW w:type="dxa" w:w="3009"/>
+          </w:tcPr>
+          <w:p>
+            <w:r>
+              <w:t>Dataverse → ECS</w:t>
+            </w:r>
+          </w:p>
+        </w:tc>
+        <w:tc>
+          <w:tcPr>
+            <w:tcW w:type="dxa" w:w="3009"/>
+          </w:tcPr>
+          <w:p>
+            <w:r>
+              <w:t>Change notification for Major entity updates</w:t>
+            </w:r>
+          </w:p>
+        </w:tc>
+      </w:tr>
     </w:tbl>
+    <w:p>
+      <w:pPr>
+        <w:pStyle w:val="Heading3"/>
+      </w:pPr>
+      <w:r>
+        <w:t>ECS Change Notification</w:t>
+      </w:r>
+    </w:p>
+    <w:p>
+      <w:r>
+        <w:t xml:space="preserve">Whenever a </w:t>
+      </w:r>
+      <w:r>
+        <w:rPr>
+          <w:b/>
+          <w:i w:val="0"/>
+        </w:rPr>
+        <w:t>Major entity</w:t>
+      </w:r>
+      <w:r>
+        <w:t xml:space="preserve"> is created or updated in Dataverse, a change notification is published to the Knight Frank </w:t>
+      </w:r>
+      <w:r>
+        <w:rPr>
+          <w:b/>
+          <w:i w:val="0"/>
+        </w:rPr>
+        <w:t>ECS (Enterprise Connectivity Services)</w:t>
+      </w:r>
+      <w:r>
+        <w:t xml:space="preserve"> platform.</w:t>
+      </w:r>
+    </w:p>
+    <w:p>
+      <w:pPr/>
+      <w:r>
+        <w:rPr>
+          <w:b/>
+          <w:i w:val="0"/>
+        </w:rPr>
+        <w:t>What:</w:t>
+      </w:r>
+      <w:r>
+        <w:t xml:space="preserve"> ECS is Knight Frank's internal notification and message bus. It notifies other systems that a change has happened — it is not a data replication service.</w:t>
+      </w:r>
+    </w:p>
+    <w:p>
+      <w:pPr/>
+      <w:r>
+        <w:rPr>
+          <w:b/>
+          <w:i w:val="0"/>
+        </w:rPr>
+        <w:t>Trigger:</w:t>
+      </w:r>
+      <w:r>
+        <w:t xml:space="preserve"> Create or update of a Major entity record.</w:t>
+      </w:r>
+    </w:p>
+    <w:p>
+      <w:pPr/>
+      <w:r>
+        <w:rPr>
+          <w:b/>
+          <w:i w:val="0"/>
+        </w:rPr>
+        <w:t>Candidate Major entities:</w:t>
+      </w:r>
+      <w:r>
+        <w:t xml:space="preserve"> Client (Account, Contact), Property (kf</w:t>
+      </w:r>
+      <w:r>
+        <w:rPr>
+          <w:b w:val="0"/>
+          <w:i/>
+        </w:rPr>
+        <w:t>Site, kf</w:t>
+      </w:r>
+      <w:r>
+        <w:t>Property), and Deal (kf_Deal) domains.</w:t>
+      </w:r>
+    </w:p>
+    <w:p>
+      <w:pPr/>
+      <w:r>
+        <w:rPr>
+          <w:b/>
+          <w:i w:val="0"/>
+        </w:rPr>
+        <w:t>Note:</w:t>
+      </w:r>
+      <w:r>
+        <w:t xml:space="preserve"> the definitive Major entity list is not yet defined in the wiki — confirm with TDA / enterprise architecture before build.</w:t>
+      </w:r>
+    </w:p>
+    <w:p>
+      <w:pPr/>
+      <w:r>
+        <w:rPr>
+          <w:b/>
+          <w:i w:val="0"/>
+        </w:rPr>
+        <w:t>Mechanism:</w:t>
+      </w:r>
+      <w:r>
+        <w:t xml:space="preserve"> Dataverse plugin or Power Automate flow on entity create/update publish a change event (entity type, record ID, changed fields, timestamp, source) to ECS.</w:t>
+      </w:r>
+    </w:p>
+    <w:p>
+      <w:pPr/>
+      <w:r>
+        <w:rPr>
+          <w:b/>
+          <w:i w:val="0"/>
+        </w:rPr>
+        <w:t>Consumers:</w:t>
+      </w:r>
+      <w:r>
+        <w:t xml:space="preserve"> any enterprise system subscribed to ECS topics reacts to the notification (e.g. downstream registries, reporting, downstream workstreams).</w:t>
+      </w:r>
+    </w:p>
+    <w:p>
+      <w:pPr/>
+      <w:r>
+        <w:rPr>
+          <w:b/>
+          <w:i w:val="0"/>
+        </w:rPr>
+        <w:t>Audit:</w:t>
+      </w:r>
+      <w:r>
+        <w:t xml:space="preserve"> all publications are logged in </w:t>
+      </w:r>
+      <w:r>
+        <w:rPr>
+          <w:rFonts w:ascii="Consolas" w:hAnsi="Consolas"/>
+          <w:b w:val="0"/>
+          <w:i w:val="0"/>
+        </w:rPr>
+        <w:t>kf_IntegrationLog</w:t>
+      </w:r>
+      <w:r>
+        <w:t>.</w:t>
+      </w:r>
+    </w:p>
     <w:p>
       <w:pPr>
         <w:pStyle w:val="Heading3"/>
@@ -21722,6 +22017,215 @@
         </w:tc>
       </w:tr>
     </w:tbl>
+    <w:p>
+      <w:pPr>
+        <w:pStyle w:val="Heading2"/>
+      </w:pPr>
+      <w:r>
+        <w:t>Major Entity Change Publishing (ECS)</w:t>
+      </w:r>
+    </w:p>
+    <w:p>
+      <w:r>
+        <w:t xml:space="preserve">Whenever a </w:t>
+      </w:r>
+      <w:r>
+        <w:rPr>
+          <w:b/>
+          <w:i w:val="0"/>
+        </w:rPr>
+        <w:t>Major entity</w:t>
+      </w:r>
+      <w:r>
+        <w:t xml:space="preserve"> is created or updated, a change notification is sent to the Knight Frank </w:t>
+      </w:r>
+      <w:r>
+        <w:rPr>
+          <w:b/>
+          <w:i w:val="0"/>
+        </w:rPr>
+        <w:t>ECS (Enterprise Connectivity Services)</w:t>
+      </w:r>
+      <w:r>
+        <w:t xml:space="preserve"> platform — the internal notification and message bus that informs other systems a change has happened.</w:t>
+      </w:r>
+    </w:p>
+    <w:tbl>
+      <w:tblPr>
+        <w:tblW w:type="auto" w:w="0"/>
+        <w:jc w:val="center"/>
+        <w:tblLook w:firstColumn="1" w:firstRow="1" w:lastColumn="0" w:lastRow="0" w:noHBand="0" w:noVBand="1" w:val="04A0"/>
+      </w:tblPr>
+      <w:tblGrid>
+        <w:gridCol w:w="4513"/>
+        <w:gridCol w:w="4513"/>
+      </w:tblGrid>
+      <w:tr>
+        <w:tc>
+          <w:tcPr>
+            <w:tcW w:type="dxa" w:w="4513"/>
+          </w:tcPr>
+          <w:p>
+            <w:r>
+              <w:rPr>
+                <w:b/>
+              </w:rPr>
+              <w:t>Aspect</w:t>
+            </w:r>
+          </w:p>
+        </w:tc>
+        <w:tc>
+          <w:tcPr>
+            <w:tcW w:type="dxa" w:w="4513"/>
+          </w:tcPr>
+          <w:p>
+            <w:r>
+              <w:rPr>
+                <w:b/>
+              </w:rPr>
+              <w:t>Design</w:t>
+            </w:r>
+          </w:p>
+        </w:tc>
+      </w:tr>
+      <w:tr>
+        <w:tc>
+          <w:tcPr>
+            <w:tcW w:type="dxa" w:w="4513"/>
+          </w:tcPr>
+          <w:p>
+            <w:r>
+              <w:t>Trigger</w:t>
+            </w:r>
+          </w:p>
+        </w:tc>
+        <w:tc>
+          <w:tcPr>
+            <w:tcW w:type="dxa" w:w="4513"/>
+          </w:tcPr>
+          <w:p>
+            <w:r>
+              <w:t>Create/update of a Major entity in Dataverse</w:t>
+            </w:r>
+          </w:p>
+        </w:tc>
+      </w:tr>
+      <w:tr>
+        <w:tc>
+          <w:tcPr>
+            <w:tcW w:type="dxa" w:w="4513"/>
+          </w:tcPr>
+          <w:p>
+            <w:r>
+              <w:t>Publish</w:t>
+            </w:r>
+          </w:p>
+        </w:tc>
+        <w:tc>
+          <w:tcPr>
+            <w:tcW w:type="dxa" w:w="4513"/>
+          </w:tcPr>
+          <w:p>
+            <w:r>
+              <w:t>Plugin / Power Automate flow → ECS topic</w:t>
+            </w:r>
+          </w:p>
+        </w:tc>
+      </w:tr>
+      <w:tr>
+        <w:tc>
+          <w:tcPr>
+            <w:tcW w:type="dxa" w:w="4513"/>
+          </w:tcPr>
+          <w:p>
+            <w:r>
+              <w:t>Payload</w:t>
+            </w:r>
+          </w:p>
+        </w:tc>
+        <w:tc>
+          <w:tcPr>
+            <w:tcW w:type="dxa" w:w="4513"/>
+          </w:tcPr>
+          <w:p>
+            <w:r>
+              <w:t>Entity type, record ID, changed fields, timestamp, source system</w:t>
+            </w:r>
+          </w:p>
+        </w:tc>
+      </w:tr>
+      <w:tr>
+        <w:tc>
+          <w:tcPr>
+            <w:tcW w:type="dxa" w:w="4513"/>
+          </w:tcPr>
+          <w:p>
+            <w:r>
+              <w:t>Candidates</w:t>
+            </w:r>
+          </w:p>
+        </w:tc>
+        <w:tc>
+          <w:tcPr>
+            <w:tcW w:type="dxa" w:w="4513"/>
+          </w:tcPr>
+          <w:p>
+            <w:r>
+              <w:t>Client (Account, Contact), Property (kf_Site, kf_Property), Deal (kf_Deal)</w:t>
+            </w:r>
+          </w:p>
+        </w:tc>
+      </w:tr>
+      <w:tr>
+        <w:tc>
+          <w:tcPr>
+            <w:tcW w:type="dxa" w:w="4513"/>
+          </w:tcPr>
+          <w:p>
+            <w:r>
+              <w:t>Audit</w:t>
+            </w:r>
+          </w:p>
+        </w:tc>
+        <w:tc>
+          <w:tcPr>
+            <w:tcW w:type="dxa" w:w="4513"/>
+          </w:tcPr>
+          <w:p>
+            <w:r>
+              <w:t>Logged in `kf_IntegrationLog`</w:t>
+            </w:r>
+          </w:p>
+        </w:tc>
+      </w:tr>
+      <w:tr>
+        <w:tc>
+          <w:tcPr>
+            <w:tcW w:type="dxa" w:w="4513"/>
+          </w:tcPr>
+          <w:p>
+            <w:r>
+              <w:t>Contract</w:t>
+            </w:r>
+          </w:p>
+        </w:tc>
+        <w:tc>
+          <w:tcPr>
+            <w:tcW w:type="dxa" w:w="4513"/>
+          </w:tcPr>
+          <w:p>
+            <w:r>
+              <w:t>Confirm definitive Major entity list and ECS topic/contract with TDA and enterprise architecture</w:t>
+            </w:r>
+          </w:p>
+        </w:tc>
+      </w:tr>
+    </w:tbl>
+    <w:p>
+      <w:r>
+        <w:t>The change events are notifications only — consumers query Dataverse (or enterprise mastered sources) for the full record; ECS does not replicate data.</w:t>
+      </w:r>
+    </w:p>
     <w:p>
       <w:pPr>
         <w:pStyle w:val="Heading2"/>
@@ -23351,6 +23855,38 @@
           </w:tcPr>
           <w:p>
             <w:r>
+              <w:t>Change Notification</w:t>
+            </w:r>
+          </w:p>
+        </w:tc>
+        <w:tc>
+          <w:tcPr>
+            <w:tcW w:type="dxa" w:w="3009"/>
+          </w:tcPr>
+          <w:p>
+            <w:r>
+              <w:t>ECS (Enterprise Connectivity Services)</w:t>
+            </w:r>
+          </w:p>
+        </w:tc>
+        <w:tc>
+          <w:tcPr>
+            <w:tcW w:type="dxa" w:w="3009"/>
+          </w:tcPr>
+          <w:p>
+            <w:r>
+              <w:t>Publish Major entity change events to the enterprise message bus</w:t>
+            </w:r>
+          </w:p>
+        </w:tc>
+      </w:tr>
+      <w:tr>
+        <w:tc>
+          <w:tcPr>
+            <w:tcW w:type="dxa" w:w="3009"/>
+          </w:tcPr>
+          <w:p>
+            <w:r>
               <w:t>APIs</w:t>
             </w:r>
           </w:p>
@@ -23377,6 +23913,18 @@
         </w:tc>
       </w:tr>
     </w:tbl>
+    <w:p>
+      <w:r>
+        <w:rPr>
+          <w:b/>
+          <w:i w:val="0"/>
+        </w:rPr>
+        <w:t>Note:</w:t>
+      </w:r>
+      <w:r>
+        <w:t xml:space="preserve"> ECS is Knight Frank's internal notification and message bus. EuroCRM publishes a change notification whenever a Major entity (Client, Property, Deal — confirm definitive list with TDA) is created or updated; subscribing systems are notified that a change has happened. See architecture application for the pattern.</w:t>
+      </w:r>
+    </w:p>
     <w:p>
       <w:pPr>
         <w:pStyle w:val="Heading3"/>
@@ -32571,7 +33119,7 @@
           </w:tcPr>
           <w:p>
             <w:r>
-              <w:t>D365 CI-Journeys (same env); Finance (future)</w:t>
+              <w:t>D365 CI-Journeys (same env); Finance (future); ECS — change notification bus (Major entity events)</w:t>
             </w:r>
           </w:p>
         </w:tc>
@@ -43199,7 +43747,7 @@
         <w:t>Core] AL2[KF</w:t>
       </w:r>
       <w:r>
-        <w:t>Europe] AL3[Country Solutions] AL4[Service Line Solutions] end subgraph "Data Layer" DL1[Dataverse] DL2[SharePoint] DL3[Power BI] end subgraph "Integration Layer" IL1[Outlook] IL2[SharePoint] IL3[D365 Finance] IL4[CI-Journeys] IL5[Loqate] end subgraph "Security Layer" SL1[Entra ID] SL2[MFA] SL3[Conditional Access] SL4[Audit Trails] end end</w:t>
+        <w:t>Europe] AL3[Country Solutions] AL4[Service Line Solutions] end subgraph "Data Layer" DL1[Dataverse] DL2[SharePoint] DL3[Power BI] end subgraph "Integration Layer" IL1[Outlook] IL2[SharePoint] IL3[D365 Finance] IL4[CI-Journeys] IL5[Loqate] IL6[ECS] end subgraph "Security Layer" SL1[Entra ID] SL2[MFA] SL3[Conditional Access] SL4[Audit Trails] end end</w:t>
       </w:r>
     </w:p>
     <w:p>
@@ -43214,7 +43762,7 @@
     </w:p>
     <w:p>
       <w:r>
-        <w:t>DL1 --&gt; IL1 DL1 --&gt; IL2 DL1 --&gt; IL3 DL1 --&gt; IL4 DL1 --&gt; IL5</w:t>
+        <w:t>DL1 --&gt; IL1 DL1 --&gt; IL2 DL1 --&gt; IL3 DL1 --&gt; IL4 DL1 --&gt; IL5 DL1 --&gt; IL6</w:t>
       </w:r>
     </w:p>
     <w:p>
@@ -43708,6 +44256,19 @@
       </w:r>
     </w:p>
     <w:p>
+      <w:pPr/>
+      <w:r>
+        <w:rPr>
+          <w:b/>
+          <w:i w:val="0"/>
+        </w:rPr>
+        <w:t>ECS change notification:</w:t>
+      </w:r>
+      <w:r>
+        <w:t xml:space="preserve"> Major entity create/update events published to the Knight Frank ECS message bus (see architecture application)</w:t>
+      </w:r>
+    </w:p>
+    <w:p>
       <w:pPr>
         <w:pStyle w:val="Heading2"/>
       </w:pPr>
@@ -44831,6 +45392,76 @@
           </w:tcPr>
           <w:p>
             <w:r>
+              <w:t>ECS (Enterprise Connectivity Services)</w:t>
+            </w:r>
+          </w:p>
+        </w:tc>
+        <w:tc>
+          <w:tcPr>
+            <w:tcW w:type="dxa" w:w="2256"/>
+          </w:tcPr>
+          <w:p>
+            <w:r>
+              <w:t>Technical</w:t>
+            </w:r>
+          </w:p>
+        </w:tc>
+        <w:tc>
+          <w:tcPr>
+            <w:tcW w:type="dxa" w:w="2256"/>
+          </w:tcPr>
+          <w:p>
+            <w:r>
+              <w:t>Must have</w:t>
+            </w:r>
+          </w:p>
+        </w:tc>
+        <w:tc>
+          <w:tcPr>
+            <w:tcW w:type="dxa" w:w="2256"/>
+          </w:tcPr>
+          <w:p>
+            <w:r>
+              <w:t>TBD</w:t>
+            </w:r>
+          </w:p>
+        </w:tc>
+      </w:tr>
+    </w:tbl>
+    <w:p>
+      <w:r>
+        <w:rPr>
+          <w:b/>
+          <w:i w:val="0"/>
+        </w:rPr>
+        <w:t>Note:</w:t>
+      </w:r>
+      <w:r>
+        <w:t xml:space="preserve"> Major entity create/update events must be published to the Knight Frank ECS platform — the internal notification and message bus that notifies other systems of changes. ECS access, topic contracts, and payload schemas are an integration dependency to be confirmed with the enterprise integration team.</w:t>
+      </w:r>
+    </w:p>
+    <w:tbl>
+      <w:tblPr>
+        <w:tblW w:type="auto" w:w="0"/>
+        <w:jc w:val="center"/>
+        <w:tblLook w:firstColumn="1" w:firstRow="1" w:lastColumn="0" w:lastRow="0" w:noHBand="0" w:noVBand="1" w:val="04A0"/>
+      </w:tblPr>
+      <w:tblGrid>
+        <w:gridCol w:w="2256"/>
+        <w:gridCol w:w="2256"/>
+        <w:gridCol w:w="2256"/>
+        <w:gridCol w:w="2256"/>
+      </w:tblGrid>
+      <w:tr>
+        <w:tc>
+          <w:tcPr>
+            <w:tcW w:type="dxa" w:w="2256"/>
+          </w:tcPr>
+          <w:p>
+            <w:r>
+              <w:rPr>
+                <w:b/>
+              </w:rPr>
               <w:t>Vendor selection</w:t>
             </w:r>
           </w:p>
@@ -44841,6 +45472,9 @@
           </w:tcPr>
           <w:p>
             <w:r>
+              <w:rPr>
+                <w:b/>
+              </w:rPr>
               <w:t>Decision</w:t>
             </w:r>
           </w:p>
@@ -44851,6 +45485,9 @@
           </w:tcPr>
           <w:p>
             <w:r>
+              <w:rPr>
+                <w:b/>
+              </w:rPr>
               <w:t>Must have</w:t>
             </w:r>
           </w:p>
@@ -44861,6 +45498,9 @@
           </w:tcPr>
           <w:p>
             <w:r>
+              <w:rPr>
+                <w:b/>
+              </w:rPr>
               <w:t>Pending</w:t>
             </w:r>
           </w:p>
@@ -56849,6 +57489,50 @@
           <w:p>
             <w:r>
               <w:t>Operational Expenditure</w:t>
+            </w:r>
+          </w:p>
+        </w:tc>
+      </w:tr>
+      <w:tr>
+        <w:tc>
+          <w:tcPr>
+            <w:tcW w:type="dxa" w:w="4513"/>
+          </w:tcPr>
+          <w:p>
+            <w:r>
+              <w:t>ECS</w:t>
+            </w:r>
+          </w:p>
+        </w:tc>
+        <w:tc>
+          <w:tcPr>
+            <w:tcW w:type="dxa" w:w="4513"/>
+          </w:tcPr>
+          <w:p>
+            <w:r>
+              <w:t>Enterprise Connectivity Services — Knight Frank's internal notification and message bus. Notifies other systems that a change has happened; it does not replicate data</w:t>
+            </w:r>
+          </w:p>
+        </w:tc>
+      </w:tr>
+      <w:tr>
+        <w:tc>
+          <w:tcPr>
+            <w:tcW w:type="dxa" w:w="4513"/>
+          </w:tcPr>
+          <w:p>
+            <w:r>
+              <w:t>Major entity</w:t>
+            </w:r>
+          </w:p>
+        </w:tc>
+        <w:tc>
+          <w:tcPr>
+            <w:tcW w:type="dxa" w:w="4513"/>
+          </w:tcPr>
+          <w:p>
+            <w:r>
+              <w:t>A core shared entity whose create/update events are published to ECS (candidates: Client, Property, Deal domains — definitive list to be confirmed with TDA)</w:t>
             </w:r>
           </w:p>
         </w:tc>

</xml_diff>

<commit_message>
vault backup: 2026-09-02 16:42:31
</commit_message>
<xml_diff>
--- a/POC-EuroCRM-Vault/projects/EuroCRM_Solution_Overview_Document_2026-08-27.docx
+++ b/POC-EuroCRM-Vault/projects/EuroCRM_Solution_Overview_Document_2026-08-27.docx
@@ -3117,11 +3117,6 @@
       </w:r>
     </w:p>
     <w:p>
-      <w:r>
-        <w:t>Status: Draft Parent: solution overview Source: European CRM Architecture Review 2.pdf</w:t>
-      </w:r>
-    </w:p>
-    <w:p>
       <w:pPr>
         <w:pStyle w:val="Heading2"/>
       </w:pPr>
@@ -3651,11 +3646,6 @@
       </w:r>
     </w:p>
     <w:p>
-      <w:r>
-        <w:t>Status: Draft Parent: solution overview Source: European CRM Architecture Review 2.pdf</w:t>
-      </w:r>
-    </w:p>
-    <w:p>
       <w:pPr>
         <w:pStyle w:val="Heading2"/>
       </w:pPr>
@@ -3754,11 +3744,6 @@
       </w:pPr>
       <w:r>
         <w:t>Business Goals and Objectives</w:t>
-      </w:r>
-    </w:p>
-    <w:p>
-      <w:r>
-        <w:t>Status: Draft Parent: solution overview Source: European CRM Architecture Review 2.pdf</w:t>
       </w:r>
     </w:p>
     <w:p>
@@ -4113,11 +4098,6 @@
       </w:pPr>
       <w:r>
         <w:t>Key Stakeholders</w:t>
-      </w:r>
-    </w:p>
-    <w:p>
-      <w:r>
-        <w:t>Status: Draft Parent: solution overview</w:t>
       </w:r>
     </w:p>
     <w:p>
@@ -6087,6 +6067,132 @@
           </w:tcPr>
           <w:p>
             <w:r>
+              <w:t>Initially, End of each phase</w:t>
+            </w:r>
+          </w:p>
+        </w:tc>
+        <w:tc>
+          <w:tcPr>
+            <w:tcW w:type="dxa" w:w="2256"/>
+          </w:tcPr>
+          <w:p>
+            <w:r>
+              <w:t>Architecture review meeting</w:t>
+            </w:r>
+          </w:p>
+        </w:tc>
+        <w:tc>
+          <w:tcPr>
+            <w:tcW w:type="dxa" w:w="2256"/>
+          </w:tcPr>
+          <w:p>
+            <w:r>
+              <w:t>Solution Lead</w:t>
+            </w:r>
+          </w:p>
+        </w:tc>
+      </w:tr>
+      <w:tr>
+        <w:tc>
+          <w:tcPr>
+            <w:tcW w:type="dxa" w:w="2256"/>
+          </w:tcPr>
+          <w:p>
+            <w:r>
+              <w:t>CTO</w:t>
+            </w:r>
+          </w:p>
+        </w:tc>
+        <w:tc>
+          <w:tcPr>
+            <w:tcW w:type="dxa" w:w="2256"/>
+          </w:tcPr>
+          <w:p>
+            <w:r>
+              <w:t>Monthly</w:t>
+            </w:r>
+          </w:p>
+        </w:tc>
+        <w:tc>
+          <w:tcPr>
+            <w:tcW w:type="dxa" w:w="2256"/>
+          </w:tcPr>
+          <w:p>
+            <w:r>
+              <w:t>Steering committee</w:t>
+            </w:r>
+          </w:p>
+        </w:tc>
+        <w:tc>
+          <w:tcPr>
+            <w:tcW w:type="dxa" w:w="2256"/>
+          </w:tcPr>
+          <w:p>
+            <w:r>
+              <w:t>Solution Lead</w:t>
+            </w:r>
+          </w:p>
+        </w:tc>
+      </w:tr>
+      <w:tr>
+        <w:tc>
+          <w:tcPr>
+            <w:tcW w:type="dxa" w:w="2256"/>
+          </w:tcPr>
+          <w:p>
+            <w:r>
+              <w:t>Regional MDs</w:t>
+            </w:r>
+          </w:p>
+        </w:tc>
+        <w:tc>
+          <w:tcPr>
+            <w:tcW w:type="dxa" w:w="2256"/>
+          </w:tcPr>
+          <w:p>
+            <w:r>
+              <w:t>Bi-weekly</w:t>
+            </w:r>
+          </w:p>
+        </w:tc>
+        <w:tc>
+          <w:tcPr>
+            <w:tcW w:type="dxa" w:w="2256"/>
+          </w:tcPr>
+          <w:p>
+            <w:r>
+              <w:t>Progress report</w:t>
+            </w:r>
+          </w:p>
+        </w:tc>
+        <w:tc>
+          <w:tcPr>
+            <w:tcW w:type="dxa" w:w="2256"/>
+          </w:tcPr>
+          <w:p>
+            <w:r>
+              <w:t>Solution Lead</w:t>
+            </w:r>
+          </w:p>
+        </w:tc>
+      </w:tr>
+      <w:tr>
+        <w:tc>
+          <w:tcPr>
+            <w:tcW w:type="dxa" w:w="2256"/>
+          </w:tcPr>
+          <w:p>
+            <w:r>
+              <w:t>CM Team</w:t>
+            </w:r>
+          </w:p>
+        </w:tc>
+        <w:tc>
+          <w:tcPr>
+            <w:tcW w:type="dxa" w:w="2256"/>
+          </w:tcPr>
+          <w:p>
+            <w:r>
               <w:t>Weekly</w:t>
             </w:r>
           </w:p>
@@ -6097,7 +6203,7 @@
           </w:tcPr>
           <w:p>
             <w:r>
-              <w:t>Architecture review meeting</w:t>
+              <w:t>Sprint review</w:t>
             </w:r>
           </w:p>
         </w:tc>
@@ -6119,27 +6225,27 @@
           </w:tcPr>
           <w:p>
             <w:r>
-              <w:t>CTO</w:t>
-            </w:r>
-          </w:p>
-        </w:tc>
-        <w:tc>
-          <w:tcPr>
-            <w:tcW w:type="dxa" w:w="2256"/>
-          </w:tcPr>
-          <w:p>
-            <w:r>
-              <w:t>Monthly</w:t>
-            </w:r>
-          </w:p>
-        </w:tc>
-        <w:tc>
-          <w:tcPr>
-            <w:tcW w:type="dxa" w:w="2256"/>
-          </w:tcPr>
-          <w:p>
-            <w:r>
-              <w:t>Steering committee</w:t>
+              <w:t>Legal/Compliance</w:t>
+            </w:r>
+          </w:p>
+        </w:tc>
+        <w:tc>
+          <w:tcPr>
+            <w:tcW w:type="dxa" w:w="2256"/>
+          </w:tcPr>
+          <w:p>
+            <w:r>
+              <w:t>Bi-weekly</w:t>
+            </w:r>
+          </w:p>
+        </w:tc>
+        <w:tc>
+          <w:tcPr>
+            <w:tcW w:type="dxa" w:w="2256"/>
+          </w:tcPr>
+          <w:p>
+            <w:r>
+              <w:t>Compliance review</w:t>
             </w:r>
           </w:p>
         </w:tc>
@@ -6161,7 +6267,91 @@
           </w:tcPr>
           <w:p>
             <w:r>
-              <w:t>Regional MDs</w:t>
+              <w:t>Finance</w:t>
+            </w:r>
+          </w:p>
+        </w:tc>
+        <w:tc>
+          <w:tcPr>
+            <w:tcW w:type="dxa" w:w="2256"/>
+          </w:tcPr>
+          <w:p>
+            <w:r>
+              <w:t>Weekly</w:t>
+            </w:r>
+          </w:p>
+        </w:tc>
+        <w:tc>
+          <w:tcPr>
+            <w:tcW w:type="dxa" w:w="2256"/>
+          </w:tcPr>
+          <w:p>
+            <w:r>
+              <w:t>Integration sync</w:t>
+            </w:r>
+          </w:p>
+        </w:tc>
+        <w:tc>
+          <w:tcPr>
+            <w:tcW w:type="dxa" w:w="2256"/>
+          </w:tcPr>
+          <w:p>
+            <w:r>
+              <w:t>Integration Lead</w:t>
+            </w:r>
+          </w:p>
+        </w:tc>
+      </w:tr>
+      <w:tr>
+        <w:tc>
+          <w:tcPr>
+            <w:tcW w:type="dxa" w:w="2256"/>
+          </w:tcPr>
+          <w:p>
+            <w:r>
+              <w:t>IT Ops</w:t>
+            </w:r>
+          </w:p>
+        </w:tc>
+        <w:tc>
+          <w:tcPr>
+            <w:tcW w:type="dxa" w:w="2256"/>
+          </w:tcPr>
+          <w:p>
+            <w:r>
+              <w:t>Daily</w:t>
+            </w:r>
+          </w:p>
+        </w:tc>
+        <w:tc>
+          <w:tcPr>
+            <w:tcW w:type="dxa" w:w="2256"/>
+          </w:tcPr>
+          <w:p>
+            <w:r>
+              <w:t>Stand-up</w:t>
+            </w:r>
+          </w:p>
+        </w:tc>
+        <w:tc>
+          <w:tcPr>
+            <w:tcW w:type="dxa" w:w="2256"/>
+          </w:tcPr>
+          <w:p>
+            <w:r>
+              <w:t>Project Lead</w:t>
+            </w:r>
+          </w:p>
+        </w:tc>
+      </w:tr>
+      <w:tr>
+        <w:tc>
+          <w:tcPr>
+            <w:tcW w:type="dxa" w:w="2256"/>
+          </w:tcPr>
+          <w:p>
+            <w:r>
+              <w:t>End Users</w:t>
             </w:r>
           </w:p>
         </w:tc>
@@ -6181,216 +6371,6 @@
           </w:tcPr>
           <w:p>
             <w:r>
-              <w:t>Progress report</w:t>
-            </w:r>
-          </w:p>
-        </w:tc>
-        <w:tc>
-          <w:tcPr>
-            <w:tcW w:type="dxa" w:w="2256"/>
-          </w:tcPr>
-          <w:p>
-            <w:r>
-              <w:t>Solution Lead</w:t>
-            </w:r>
-          </w:p>
-        </w:tc>
-      </w:tr>
-      <w:tr>
-        <w:tc>
-          <w:tcPr>
-            <w:tcW w:type="dxa" w:w="2256"/>
-          </w:tcPr>
-          <w:p>
-            <w:r>
-              <w:t>CM Team</w:t>
-            </w:r>
-          </w:p>
-        </w:tc>
-        <w:tc>
-          <w:tcPr>
-            <w:tcW w:type="dxa" w:w="2256"/>
-          </w:tcPr>
-          <w:p>
-            <w:r>
-              <w:t>Weekly</w:t>
-            </w:r>
-          </w:p>
-        </w:tc>
-        <w:tc>
-          <w:tcPr>
-            <w:tcW w:type="dxa" w:w="2256"/>
-          </w:tcPr>
-          <w:p>
-            <w:r>
-              <w:t>Sprint review</w:t>
-            </w:r>
-          </w:p>
-        </w:tc>
-        <w:tc>
-          <w:tcPr>
-            <w:tcW w:type="dxa" w:w="2256"/>
-          </w:tcPr>
-          <w:p>
-            <w:r>
-              <w:t>Solution Lead</w:t>
-            </w:r>
-          </w:p>
-        </w:tc>
-      </w:tr>
-      <w:tr>
-        <w:tc>
-          <w:tcPr>
-            <w:tcW w:type="dxa" w:w="2256"/>
-          </w:tcPr>
-          <w:p>
-            <w:r>
-              <w:t>Legal/Compliance</w:t>
-            </w:r>
-          </w:p>
-        </w:tc>
-        <w:tc>
-          <w:tcPr>
-            <w:tcW w:type="dxa" w:w="2256"/>
-          </w:tcPr>
-          <w:p>
-            <w:r>
-              <w:t>Bi-weekly</w:t>
-            </w:r>
-          </w:p>
-        </w:tc>
-        <w:tc>
-          <w:tcPr>
-            <w:tcW w:type="dxa" w:w="2256"/>
-          </w:tcPr>
-          <w:p>
-            <w:r>
-              <w:t>Compliance review</w:t>
-            </w:r>
-          </w:p>
-        </w:tc>
-        <w:tc>
-          <w:tcPr>
-            <w:tcW w:type="dxa" w:w="2256"/>
-          </w:tcPr>
-          <w:p>
-            <w:r>
-              <w:t>Solution Lead</w:t>
-            </w:r>
-          </w:p>
-        </w:tc>
-      </w:tr>
-      <w:tr>
-        <w:tc>
-          <w:tcPr>
-            <w:tcW w:type="dxa" w:w="2256"/>
-          </w:tcPr>
-          <w:p>
-            <w:r>
-              <w:t>Finance</w:t>
-            </w:r>
-          </w:p>
-        </w:tc>
-        <w:tc>
-          <w:tcPr>
-            <w:tcW w:type="dxa" w:w="2256"/>
-          </w:tcPr>
-          <w:p>
-            <w:r>
-              <w:t>Weekly</w:t>
-            </w:r>
-          </w:p>
-        </w:tc>
-        <w:tc>
-          <w:tcPr>
-            <w:tcW w:type="dxa" w:w="2256"/>
-          </w:tcPr>
-          <w:p>
-            <w:r>
-              <w:t>Integration sync</w:t>
-            </w:r>
-          </w:p>
-        </w:tc>
-        <w:tc>
-          <w:tcPr>
-            <w:tcW w:type="dxa" w:w="2256"/>
-          </w:tcPr>
-          <w:p>
-            <w:r>
-              <w:t>Integration Lead</w:t>
-            </w:r>
-          </w:p>
-        </w:tc>
-      </w:tr>
-      <w:tr>
-        <w:tc>
-          <w:tcPr>
-            <w:tcW w:type="dxa" w:w="2256"/>
-          </w:tcPr>
-          <w:p>
-            <w:r>
-              <w:t>IT Ops</w:t>
-            </w:r>
-          </w:p>
-        </w:tc>
-        <w:tc>
-          <w:tcPr>
-            <w:tcW w:type="dxa" w:w="2256"/>
-          </w:tcPr>
-          <w:p>
-            <w:r>
-              <w:t>Daily</w:t>
-            </w:r>
-          </w:p>
-        </w:tc>
-        <w:tc>
-          <w:tcPr>
-            <w:tcW w:type="dxa" w:w="2256"/>
-          </w:tcPr>
-          <w:p>
-            <w:r>
-              <w:t>Stand-up</w:t>
-            </w:r>
-          </w:p>
-        </w:tc>
-        <w:tc>
-          <w:tcPr>
-            <w:tcW w:type="dxa" w:w="2256"/>
-          </w:tcPr>
-          <w:p>
-            <w:r>
-              <w:t>Project Lead</w:t>
-            </w:r>
-          </w:p>
-        </w:tc>
-      </w:tr>
-      <w:tr>
-        <w:tc>
-          <w:tcPr>
-            <w:tcW w:type="dxa" w:w="2256"/>
-          </w:tcPr>
-          <w:p>
-            <w:r>
-              <w:t>End Users</w:t>
-            </w:r>
-          </w:p>
-        </w:tc>
-        <w:tc>
-          <w:tcPr>
-            <w:tcW w:type="dxa" w:w="2256"/>
-          </w:tcPr>
-          <w:p>
-            <w:r>
-              <w:t>Bi-weekly</w:t>
-            </w:r>
-          </w:p>
-        </w:tc>
-        <w:tc>
-          <w:tcPr>
-            <w:tcW w:type="dxa" w:w="2256"/>
-          </w:tcPr>
-          <w:p>
-            <w:r>
               <w:t>Demo and feedback</w:t>
             </w:r>
           </w:p>
@@ -6459,11 +6439,6 @@
       </w:pPr>
       <w:r>
         <w:t>Business Capabilities</w:t>
-      </w:r>
-    </w:p>
-    <w:p>
-      <w:r>
-        <w:t>Status: Draft Parent: solution overview</w:t>
       </w:r>
     </w:p>
     <w:p>
@@ -7598,11 +7573,6 @@
       </w:r>
     </w:p>
     <w:p>
-      <w:r>
-        <w:t>Status: Draft Parent: solution overview</w:t>
-      </w:r>
-    </w:p>
-    <w:p>
       <w:pPr>
         <w:pStyle w:val="Heading2"/>
       </w:pPr>
@@ -9579,11 +9549,6 @@
       </w:r>
     </w:p>
     <w:p>
-      <w:r>
-        <w:t>Status: Draft Parent: solution overview</w:t>
-      </w:r>
-    </w:p>
-    <w:p>
       <w:pPr>
         <w:pStyle w:val="Heading2"/>
       </w:pPr>
@@ -11601,11 +11566,6 @@
       </w:r>
     </w:p>
     <w:p>
-      <w:r>
-        <w:t>Status: Draft Parent: solution overview</w:t>
-      </w:r>
-    </w:p>
-    <w:p>
       <w:pPr>
         <w:pStyle w:val="Heading2"/>
       </w:pPr>
@@ -12416,11 +12376,6 @@
       </w:r>
     </w:p>
     <w:p>
-      <w:r>
-        <w:t>Status: Draft Parent: solution overview Source: European CRM Architecture Review 2.pdf</w:t>
-      </w:r>
-    </w:p>
-    <w:p>
       <w:pPr>
         <w:pStyle w:val="Heading2"/>
       </w:pPr>
@@ -12759,11 +12714,6 @@
       </w:pPr>
       <w:r>
         <w:t>Architecture — Overview Diagrams</w:t>
-      </w:r>
-    </w:p>
-    <w:p>
-      <w:r>
-        <w:t>Status: Draft Parent: solution overview</w:t>
       </w:r>
     </w:p>
     <w:p>
@@ -13017,11 +12967,6 @@
       </w:r>
     </w:p>
     <w:p>
-      <w:r>
-        <w:t>Status: Draft Parent: solution overview Source: European CRM Architecture Review 2.pdf, EU CRM Data Model.xlsx</w:t>
-      </w:r>
-    </w:p>
-    <w:p>
       <w:pPr>
         <w:pStyle w:val="Heading2"/>
       </w:pPr>
@@ -14950,11 +14895,6 @@
       </w:pPr>
       <w:r>
         <w:t>Architecture — Business</w:t>
-      </w:r>
-    </w:p>
-    <w:p>
-      <w:r>
-        <w:t>Status: Draft Parent: solution overview Source: European CRM Architecture Review 2.pdf, EU CRM Data Model.xlsx</w:t>
       </w:r>
     </w:p>
     <w:p>
@@ -17172,11 +17112,6 @@
       </w:r>
     </w:p>
     <w:p>
-      <w:r>
-        <w:t>Status: Draft Parent: solution overview Source: European CRM Architecture Review 2.pdf, EU CRM Data Model.xlsx</w:t>
-      </w:r>
-    </w:p>
-    <w:p>
       <w:pPr>
         <w:pStyle w:val="Heading2"/>
       </w:pPr>
@@ -20590,51 +20525,6 @@
       </w:r>
     </w:p>
     <w:p>
-      <w:r>
-        <w:t>Status: Draft Parent: solution overview Sources: European CRM Architecture Review 2.pdf, EU CRM Data Model.xlsx, European</w:t>
-      </w:r>
-      <w:r>
-        <w:rPr>
-          <w:b w:val="0"/>
-          <w:i/>
-        </w:rPr>
-        <w:t>CRM</w:t>
-      </w:r>
-      <w:r>
-        <w:t>Client</w:t>
-      </w:r>
-      <w:r>
-        <w:rPr>
-          <w:b w:val="0"/>
-          <w:i/>
-        </w:rPr>
-        <w:t>Industry</w:t>
-      </w:r>
-      <w:r>
-        <w:t>Master</w:t>
-      </w:r>
-      <w:r>
-        <w:rPr>
-          <w:b w:val="0"/>
-          <w:i/>
-        </w:rPr>
-        <w:t>Taxonomy.xlsx, European</w:t>
-      </w:r>
-      <w:r>
-        <w:t>CRM</w:t>
-      </w:r>
-      <w:r>
-        <w:rPr>
-          <w:b w:val="0"/>
-          <w:i/>
-        </w:rPr>
-        <w:t>Property360</w:t>
-      </w:r>
-      <w:r>
-        <w:t>Master_Taxonomy.xlsx</w:t>
-      </w:r>
-    </w:p>
-    <w:p>
       <w:pPr>
         <w:pStyle w:val="Heading2"/>
       </w:pPr>
@@ -23305,11 +23195,6 @@
       </w:pPr>
       <w:r>
         <w:t>Architecture — Technology</w:t>
-      </w:r>
-    </w:p>
-    <w:p>
-      <w:r>
-        <w:t>Status: Draft Parent: solution overview Source: European CRM Architecture Review 2.pdf, EU CRM Data Model.xlsx</w:t>
       </w:r>
     </w:p>
     <w:p>
@@ -26074,11 +25959,6 @@
       </w:pPr>
       <w:r>
         <w:t>Client Data Model — One Client, One View</w:t>
-      </w:r>
-    </w:p>
-    <w:p>
-      <w:r>
-        <w:t>Status: Draft Parent: solution overview Source: European CRM Architecture Review 2.pdf</w:t>
       </w:r>
     </w:p>
     <w:p>
@@ -26690,11 +26570,6 @@
       </w:r>
     </w:p>
     <w:p>
-      <w:r>
-        <w:t>Status: Draft Parent: solution overview Source: European CRM Architecture Review 2.pdf</w:t>
-      </w:r>
-    </w:p>
-    <w:p>
       <w:pPr>
         <w:pStyle w:val="Heading2"/>
       </w:pPr>
@@ -28435,11 +28310,6 @@
       </w:r>
     </w:p>
     <w:p>
-      <w:r>
-        <w:t>Status: Draft Parent: solution overview Source: European CRM Architecture Review 2.pdf</w:t>
-      </w:r>
-    </w:p>
-    <w:p>
       <w:pPr>
         <w:pStyle w:val="Heading2"/>
       </w:pPr>
@@ -30013,11 +29883,6 @@
       </w:r>
     </w:p>
     <w:p>
-      <w:r>
-        <w:t>Status: Draft Parent: solution overview Source: European CRM Architecture Review 2.pdf</w:t>
-      </w:r>
-    </w:p>
-    <w:p>
       <w:pPr>
         <w:pStyle w:val="Heading2"/>
       </w:pPr>
@@ -30863,11 +30728,6 @@
       </w:r>
     </w:p>
     <w:p>
-      <w:r>
-        <w:t>Status: Draft Parent: solution overview Source: EU CRM Data Model.xlsx</w:t>
-      </w:r>
-    </w:p>
-    <w:p>
       <w:pPr>
         <w:pStyle w:val="Heading2"/>
       </w:pPr>
@@ -32415,11 +32275,6 @@
       </w:pPr>
       <w:r>
         <w:t>Core Data Model Tables</w:t>
-      </w:r>
-    </w:p>
-    <w:p>
-      <w:r>
-        <w:t>Status: Draft Parent: data model overview Source: EU CRM Data Model.xlsx</w:t>
       </w:r>
     </w:p>
     <w:p>
@@ -34087,11 +33942,6 @@
       </w:r>
     </w:p>
     <w:p>
-      <w:r>
-        <w:t>Status: Draft Parent: solution overview Source: European CRM Architecture Review 2.pdf</w:t>
-      </w:r>
-    </w:p>
-    <w:p>
       <w:pPr>
         <w:pStyle w:val="Heading2"/>
       </w:pPr>
@@ -34573,51 +34423,6 @@
       </w:pPr>
       <w:r>
         <w:t>Taxonomy Mappings</w:t>
-      </w:r>
-    </w:p>
-    <w:p>
-      <w:r>
-        <w:t>Status: Draft Parent: solution overview Sources: European CRM Architecture Review 2.pdf, European</w:t>
-      </w:r>
-      <w:r>
-        <w:rPr>
-          <w:b w:val="0"/>
-          <w:i/>
-        </w:rPr>
-        <w:t>CRM</w:t>
-      </w:r>
-      <w:r>
-        <w:t>Client</w:t>
-      </w:r>
-      <w:r>
-        <w:rPr>
-          <w:b w:val="0"/>
-          <w:i/>
-        </w:rPr>
-        <w:t>Industry</w:t>
-      </w:r>
-      <w:r>
-        <w:t>Master</w:t>
-      </w:r>
-      <w:r>
-        <w:rPr>
-          <w:b w:val="0"/>
-          <w:i/>
-        </w:rPr>
-        <w:t>Taxonomy.xlsx, European</w:t>
-      </w:r>
-      <w:r>
-        <w:t>CRM</w:t>
-      </w:r>
-      <w:r>
-        <w:rPr>
-          <w:b w:val="0"/>
-          <w:i/>
-        </w:rPr>
-        <w:t>Property360</w:t>
-      </w:r>
-      <w:r>
-        <w:t>Master_Taxonomy.xlsx</w:t>
       </w:r>
     </w:p>
     <w:p>
@@ -36364,11 +36169,6 @@
       </w:pPr>
       <w:r>
         <w:t>HILUCS to KF Asset Class Mapping</w:t>
-      </w:r>
-    </w:p>
-    <w:p>
-      <w:r>
-        <w:t>Status: Draft Parent: taxonomy mappings Source: European CRM Architecture Review 2.pdf</w:t>
       </w:r>
     </w:p>
     <w:p>
@@ -39831,11 +39631,6 @@
       </w:r>
     </w:p>
     <w:p>
-      <w:r>
-        <w:t>Status: Draft Parent: taxonomy mappings Source: European CRM Architecture Review 2.pdf</w:t>
-      </w:r>
-    </w:p>
-    <w:p>
       <w:pPr>
         <w:pStyle w:val="Heading2"/>
       </w:pPr>
@@ -43378,11 +43173,6 @@
       </w:r>
     </w:p>
     <w:p>
-      <w:r>
-        <w:t>Status: Draft Parent: solution overview</w:t>
-      </w:r>
-    </w:p>
-    <w:p>
       <w:pPr>
         <w:pStyle w:val="Heading2"/>
       </w:pPr>
@@ -44988,11 +44778,6 @@
       </w:pPr>
       <w:r>
         <w:t>Architecture — Target State</w:t>
-      </w:r>
-    </w:p>
-    <w:p>
-      <w:r>
-        <w:t>Status: Draft Parent: solution overview</w:t>
       </w:r>
     </w:p>
     <w:p>
@@ -46619,11 +46404,6 @@
       </w:r>
     </w:p>
     <w:p>
-      <w:r>
-        <w:t>Status: Draft Parent: solution overview</w:t>
-      </w:r>
-    </w:p>
-    <w:p>
       <w:pPr>
         <w:pStyle w:val="Heading2"/>
       </w:pPr>
@@ -47061,11 +46841,6 @@
       </w:r>
     </w:p>
     <w:p>
-      <w:r>
-        <w:t>Status: Draft Parent: solution overview</w:t>
-      </w:r>
-    </w:p>
-    <w:p>
       <w:pPr>
         <w:pStyle w:val="Heading2"/>
       </w:pPr>
@@ -47210,11 +46985,6 @@
       </w:r>
     </w:p>
     <w:p>
-      <w:r>
-        <w:t>Status: Draft Parent: solution overview</w:t>
-      </w:r>
-    </w:p>
-    <w:p>
       <w:pPr>
         <w:pStyle w:val="Heading2"/>
       </w:pPr>
@@ -47400,11 +47170,6 @@
       </w:pPr>
       <w:r>
         <w:t>Risks and Issues</w:t>
-      </w:r>
-    </w:p>
-    <w:p>
-      <w:r>
-        <w:t>Status: Draft Parent: solution overview</w:t>
       </w:r>
     </w:p>
     <w:p>
@@ -47819,11 +47584,6 @@
       </w:r>
     </w:p>
     <w:p>
-      <w:r>
-        <w:t>Status: Draft Parent: solution overview</w:t>
-      </w:r>
-    </w:p>
-    <w:p>
       <w:pPr>
         <w:pStyle w:val="Heading2"/>
       </w:pPr>
@@ -47937,11 +47697,6 @@
       </w:pPr>
       <w:r>
         <w:t>Power Apps Model-Driven Apps Rationale</w:t>
-      </w:r>
-    </w:p>
-    <w:p>
-      <w:r>
-        <w:t>Status: Draft Parent: solution overview Source: European CRM Architecture Review 2.pdf</w:t>
       </w:r>
     </w:p>
     <w:p>
@@ -48264,11 +48019,6 @@
       </w:pPr>
       <w:r>
         <w:t>Implementation Roadmap — Phases</w:t>
-      </w:r>
-    </w:p>
-    <w:p>
-      <w:r>
-        <w:t>Status: Draft Parent: solution overview</w:t>
       </w:r>
     </w:p>
     <w:p>
@@ -48491,11 +48241,6 @@
       </w:pPr>
       <w:r>
         <w:t>Implementation Roadmap — Timelines</w:t>
-      </w:r>
-    </w:p>
-    <w:p>
-      <w:r>
-        <w:t>Status: Draft Parent: solution overview</w:t>
       </w:r>
     </w:p>
     <w:p>
@@ -51743,11 +51488,6 @@
       </w:r>
     </w:p>
     <w:p>
-      <w:r>
-        <w:t>Status: Draft Parent: solution overview</w:t>
-      </w:r>
-    </w:p>
-    <w:p>
       <w:pPr>
         <w:pStyle w:val="Heading2"/>
       </w:pPr>
@@ -54703,11 +54443,6 @@
       </w:r>
     </w:p>
     <w:p>
-      <w:r>
-        <w:t>Status: Draft Parent: solution overview Source: EU CRM Data Model.xlsx</w:t>
-      </w:r>
-    </w:p>
-    <w:p>
       <w:pPr>
         <w:pStyle w:val="Heading2"/>
       </w:pPr>
@@ -58389,11 +58124,6 @@
       </w:r>
     </w:p>
     <w:p>
-      <w:r>
-        <w:t>Status: Draft Parent: solution overview</w:t>
-      </w:r>
-    </w:p>
-    <w:p>
       <w:pPr>
         <w:pStyle w:val="Heading2"/>
       </w:pPr>
@@ -58659,11 +58389,6 @@
       </w:pPr>
       <w:r>
         <w:t>Expected Benefits</w:t>
-      </w:r>
-    </w:p>
-    <w:p>
-      <w:r>
-        <w:t>Status: Draft Parent: solution overview</w:t>
       </w:r>
     </w:p>
     <w:p>
@@ -58878,11 +58603,6 @@
       </w:pPr>
       <w:r>
         <w:t>Governance — Approval</w:t>
-      </w:r>
-    </w:p>
-    <w:p>
-      <w:r>
-        <w:t>Status: Draft Parent: solution overview</w:t>
       </w:r>
     </w:p>
     <w:p>
@@ -59139,11 +58859,6 @@
       </w:r>
     </w:p>
     <w:p>
-      <w:r>
-        <w:t>Status: Draft Parent: solution overview</w:t>
-      </w:r>
-    </w:p>
-    <w:p>
       <w:pPr>
         <w:pStyle w:val="Heading2"/>
       </w:pPr>
@@ -59255,11 +58970,6 @@
       </w:pPr>
       <w:r>
         <w:t>Compliance</w:t>
-      </w:r>
-    </w:p>
-    <w:p>
-      <w:r>
-        <w:t>Status: Draft Parent: solution overview</w:t>
       </w:r>
     </w:p>
     <w:p>
@@ -59528,11 +59238,6 @@
       </w:pPr>
       <w:r>
         <w:t>Glossary</w:t>
-      </w:r>
-    </w:p>
-    <w:p>
-      <w:r>
-        <w:t>Status: Draft Parent: solution overview</w:t>
       </w:r>
     </w:p>
     <w:p>

</xml_diff>